<commit_message>
drafted more sessions as well as task manager doc
</commit_message>
<xml_diff>
--- a/Module_2_Oct_2026/Module2_exercise_plan.docx
+++ b/Module_2_Oct_2026/Module2_exercise_plan.docx
@@ -1839,6 +1839,542 @@
                 <w:szCs w:val="18"/>
               </w:rPr>
               <w:t xml:space="preserve">PLACEHOLDER — awaiting DOH data</w:t>
+            </w:r>
+          </w:p>
+        </w:tc>
+      </w:tr>
+    </w:tbl>
+    <w:p>
+      <w:pPr>
+        <w:pStyle w:val="Heading1"/>
+      </w:pPr>
+      <w:r>
+        <w:t>Oct 12, Session 3 — Spot the Problem (Naive Comparisons and RCT Reading)</w:t>
+      </w:r>
+    </w:p>
+    <w:tbl>
+      <w:tblPr>
+        <w:tblW w:type="auto" w:w="0"/>
+        <w:tblLook w:firstColumn="1" w:firstRow="1" w:lastColumn="0" w:lastRow="0" w:noHBand="0" w:noVBand="1" w:val="04A0"/>
+      </w:tblPr>
+      <w:tblGrid>
+        <w:gridCol w:w="2280"/>
+        <w:gridCol w:w="2280"/>
+        <w:gridCol w:w="2280"/>
+        <w:gridCol w:w="2280"/>
+        <w:gridCol w:w="2280"/>
+        <w:gridCol w:w="2280"/>
+      </w:tblGrid>
+      <w:tr>
+        <w:tc>
+          <w:tcPr>
+            <w:tcW w:type="dxa" w:w="2280"/>
+          </w:tcPr>
+          <w:p>
+            <w:r>
+              <w:rPr>
+                <w:b/>
+              </w:rPr>
+              <w:t>Exercise</w:t>
+            </w:r>
+          </w:p>
+        </w:tc>
+        <w:tc>
+          <w:tcPr>
+            <w:tcW w:type="dxa" w:w="2280"/>
+          </w:tcPr>
+          <w:p>
+            <w:r>
+              <w:rPr>
+                <w:b/>
+              </w:rPr>
+              <w:t>When (approx.)</w:t>
+            </w:r>
+          </w:p>
+        </w:tc>
+        <w:tc>
+          <w:tcPr>
+            <w:tcW w:type="dxa" w:w="2280"/>
+          </w:tcPr>
+          <w:p>
+            <w:r>
+              <w:rPr>
+                <w:b/>
+              </w:rPr>
+              <w:t>Type</w:t>
+            </w:r>
+          </w:p>
+        </w:tc>
+        <w:tc>
+          <w:tcPr>
+            <w:tcW w:type="dxa" w:w="2280"/>
+          </w:tcPr>
+          <w:p>
+            <w:r>
+              <w:rPr>
+                <w:b/>
+              </w:rPr>
+              <w:t>Materials needed</w:t>
+            </w:r>
+          </w:p>
+        </w:tc>
+        <w:tc>
+          <w:tcPr>
+            <w:tcW w:type="dxa" w:w="2280"/>
+          </w:tcPr>
+          <w:p>
+            <w:r>
+              <w:rPr>
+                <w:b/>
+              </w:rPr>
+              <w:t>What the partner builds / needs to know</w:t>
+            </w:r>
+          </w:p>
+        </w:tc>
+        <w:tc>
+          <w:tcPr>
+            <w:tcW w:type="dxa" w:w="2280"/>
+          </w:tcPr>
+          <w:p>
+            <w:r>
+              <w:rPr>
+                <w:b/>
+              </w:rPr>
+              <w:t>Status</w:t>
+            </w:r>
+          </w:p>
+        </w:tc>
+      </w:tr>
+      <w:tr>
+        <w:tc>
+          <w:tcPr>
+            <w:tcW w:type="dxa" w:w="2280"/>
+          </w:tcPr>
+          <w:p>
+            <w:r>
+              <w:t>“Which would you trust?” poll</w:t>
+            </w:r>
+          </w:p>
+        </w:tc>
+        <w:tc>
+          <w:tcPr>
+            <w:tcW w:type="dxa" w:w="2280"/>
+          </w:tcPr>
+          <w:p>
+            <w:r>
+              <w:t>~0:07 · Section 1, slide “Which would you trust?”</w:t>
+            </w:r>
+          </w:p>
+        </w:tc>
+        <w:tc>
+          <w:tcPr>
+            <w:tcW w:type="dxa" w:w="2280"/>
+          </w:tcPr>
+          <w:p>
+            <w:r>
+              <w:t>Menti live poll (multiple choice)</w:t>
+            </w:r>
+          </w:p>
+        </w:tc>
+        <w:tc>
+          <w:tcPr>
+            <w:tcW w:type="dxa" w:w="2280"/>
+          </w:tcPr>
+          <w:p>
+            <w:r>
+              <w:t>Menti poll, 3 options</w:t>
+            </w:r>
+          </w:p>
+        </w:tc>
+        <w:tc>
+          <w:tcPr>
+            <w:tcW w:type="dxa" w:w="2280"/>
+          </w:tcPr>
+          <w:p>
+            <w:r>
+              <w:t>Single MC: “Both comparisons say GreenWaste worked. Which would you trust more?” Options: Before-and-after / With-and-without / Neither on its own. Show live results before the Section 2 reveal; collect a few verbal “why” answers.</w:t>
+            </w:r>
+          </w:p>
+        </w:tc>
+        <w:tc>
+          <w:tcPr>
+            <w:tcW w:type="dxa" w:w="2280"/>
+          </w:tcPr>
+          <w:p>
+            <w:r>
+              <w:t>Menti poll to build</w:t>
+            </w:r>
+          </w:p>
+        </w:tc>
+      </w:tr>
+      <w:tr>
+        <w:tc>
+          <w:tcPr>
+            <w:tcW w:type="dxa" w:w="2280"/>
+          </w:tcPr>
+          <w:p>
+            <w:r>
+              <w:t>“What might be wrong?” word cloud</w:t>
+            </w:r>
+          </w:p>
+        </w:tc>
+        <w:tc>
+          <w:tcPr>
+            <w:tcW w:type="dxa" w:w="2280"/>
+          </w:tcPr>
+          <w:p>
+            <w:r>
+              <w:t>~0:09 · Section 1, slide “What might be wrong?”</w:t>
+            </w:r>
+          </w:p>
+        </w:tc>
+        <w:tc>
+          <w:tcPr>
+            <w:tcW w:type="dxa" w:w="2280"/>
+          </w:tcPr>
+          <w:p>
+            <w:r>
+              <w:t>Menti open text / word cloud</w:t>
+            </w:r>
+          </w:p>
+        </w:tc>
+        <w:tc>
+          <w:tcPr>
+            <w:tcW w:type="dxa" w:w="2280"/>
+          </w:tcPr>
+          <w:p>
+            <w:r>
+              <w:t>Menti open-text question</w:t>
+            </w:r>
+          </w:p>
+        </w:tc>
+        <w:tc>
+          <w:tcPr>
+            <w:tcW w:type="dxa" w:w="2280"/>
+          </w:tcPr>
+          <w:p>
+            <w:r>
+              <w:t>Open-text prompt: “In one phrase, what might be wrong with each of these comparisons?” rendered as a live word cloud. Run right after the poll, before Section 2.</w:t>
+            </w:r>
+          </w:p>
+        </w:tc>
+        <w:tc>
+          <w:tcPr>
+            <w:tcW w:type="dxa" w:w="2280"/>
+          </w:tcPr>
+          <w:p>
+            <w:r>
+              <w:t>Menti poll to build</w:t>
+            </w:r>
+          </w:p>
+        </w:tc>
+      </w:tr>
+      <w:tr>
+        <w:tc>
+          <w:tcPr>
+            <w:tcW w:type="dxa" w:w="2280"/>
+          </w:tcPr>
+          <w:p>
+            <w:r>
+              <w:t>“On your desk” pair discussion</w:t>
+            </w:r>
+          </w:p>
+        </w:tc>
+        <w:tc>
+          <w:tcPr>
+            <w:tcW w:type="dxa" w:w="2280"/>
+          </w:tcPr>
+          <w:p>
+            <w:r>
+              <w:t>~0:16 · Section 2, slide “On your desk”</w:t>
+            </w:r>
+          </w:p>
+        </w:tc>
+        <w:tc>
+          <w:tcPr>
+            <w:tcW w:type="dxa" w:w="2280"/>
+          </w:tcPr>
+          <w:p>
+            <w:r>
+              <w:t>Think-pair-share (no tech)</w:t>
+            </w:r>
+          </w:p>
+        </w:tc>
+        <w:tc>
+          <w:tcPr>
+            <w:tcW w:type="dxa" w:w="2280"/>
+          </w:tcPr>
+          <w:p>
+            <w:r>
+              <w:t>None (optional flipchart)</w:t>
+            </w:r>
+          </w:p>
+        </w:tc>
+        <w:tc>
+          <w:tcPr>
+            <w:tcW w:type="dxa" w:w="2280"/>
+          </w:tcPr>
+          <w:p>
+            <w:r>
+              <w:t>Prompt: was a recent evaluation you received a before-and-after or a with-and-without number, and which of the two problems could it have had? 90 seconds in pairs, two or three examples to the room. No partner build.</w:t>
+            </w:r>
+          </w:p>
+        </w:tc>
+        <w:tc>
+          <w:tcPr>
+            <w:tcW w:type="dxa" w:w="2280"/>
+          </w:tcPr>
+          <w:p>
+            <w:r>
+              <w:t>In slides</w:t>
+            </w:r>
+          </w:p>
+        </w:tc>
+      </w:tr>
+      <w:tr>
+        <w:tc>
+          <w:tcPr>
+            <w:tcW w:type="dxa" w:w="2280"/>
+          </w:tcPr>
+          <w:p>
+            <w:r>
+              <w:t>Randomisation true/false quiz</w:t>
+            </w:r>
+          </w:p>
+        </w:tc>
+        <w:tc>
+          <w:tcPr>
+            <w:tcW w:type="dxa" w:w="2280"/>
+          </w:tcPr>
+          <w:p>
+            <w:r>
+              <w:t>~0:24 · Section 3, slide “True or false?”</w:t>
+            </w:r>
+          </w:p>
+        </w:tc>
+        <w:tc>
+          <w:tcPr>
+            <w:tcW w:type="dxa" w:w="2280"/>
+          </w:tcPr>
+          <w:p>
+            <w:r>
+              <w:t>Menti quiz (true/false)</w:t>
+            </w:r>
+          </w:p>
+        </w:tc>
+        <w:tc>
+          <w:tcPr>
+            <w:tcW w:type="dxa" w:w="2280"/>
+          </w:tcPr>
+          <w:p>
+            <w:r>
+              <w:t>Menti quiz, 3 statements</w:t>
+            </w:r>
+          </w:p>
+        </w:tc>
+        <w:tc>
+          <w:tcPr>
+            <w:tcW w:type="dxa" w:w="2280"/>
+          </w:tcPr>
+          <w:p>
+            <w:r>
+              <w:t>Three true/false statements on what randomisation does and does not do (text on the slide). Reveal one at a time. Item 1 (“only balances measured things”) is the key misconception.</w:t>
+            </w:r>
+          </w:p>
+        </w:tc>
+        <w:tc>
+          <w:tcPr>
+            <w:tcW w:type="dxa" w:w="2280"/>
+          </w:tcPr>
+          <w:p>
+            <w:r>
+              <w:t>Menti quiz to build</w:t>
+            </w:r>
+          </w:p>
+        </w:tc>
+      </w:tr>
+      <w:tr>
+        <w:tc>
+          <w:tcPr>
+            <w:tcW w:type="dxa" w:w="2280"/>
+          </w:tcPr>
+          <w:p>
+            <w:r>
+              <w:t>AI Snapshot — main group exercise</w:t>
+            </w:r>
+          </w:p>
+        </w:tc>
+        <w:tc>
+          <w:tcPr>
+            <w:tcW w:type="dxa" w:w="2280"/>
+          </w:tcPr>
+          <w:p>
+            <w:r>
+              <w:t>~0:38–0:56 · Section 5</w:t>
+            </w:r>
+          </w:p>
+        </w:tc>
+        <w:tc>
+          <w:tcPr>
+            <w:tcW w:type="dxa" w:w="2280"/>
+          </w:tcPr>
+          <w:p>
+            <w:r>
+              <w:t>Group work (pairs / tables)</w:t>
+            </w:r>
+          </w:p>
+        </w:tc>
+        <w:tc>
+          <w:tcPr>
+            <w:tcW w:type="dxa" w:w="2280"/>
+          </w:tcPr>
+          <w:p>
+            <w:r>
+              <w:t>Printed flawed AI answer (for mark-up), one per pair; two prompt cards (short Prompt A, full Prompt B), one set per group; a working AI tool per table, tested beforehand</w:t>
+            </w:r>
+          </w:p>
+        </w:tc>
+        <w:tc>
+          <w:tcPr>
+            <w:tcW w:type="dxa" w:w="2280"/>
+          </w:tcPr>
+          <w:p>
+            <w:r>
+              <w:t>Three parts: (1) groups mark up the flawed AI answer and find the four planted errors; (2) run the short prompt vs the full prompt on the same before-and-after scenario and compare; (3) paste the second answer into a fresh chat and ask it to review for errors. Partner: produce the printed flawed-answer handout (verbatim response with the four errors) plus a facilitator key, the two prompt cards, and a short debrief worksheet. NOTE: the flawed answer in the deck is an invented placeholder for now; swap in Fiona’s real screenshot capture when available.</w:t>
+            </w:r>
+          </w:p>
+        </w:tc>
+        <w:tc>
+          <w:tcPr>
+            <w:tcW w:type="dxa" w:w="2280"/>
+          </w:tcPr>
+          <w:p>
+            <w:r>
+              <w:t>Handouts to build (deck refers to them)</w:t>
+            </w:r>
+          </w:p>
+        </w:tc>
+      </w:tr>
+      <w:tr>
+        <w:tc>
+          <w:tcPr>
+            <w:tcW w:type="dxa" w:w="2280"/>
+          </w:tcPr>
+          <w:p>
+            <w:r>
+              <w:t>Abu Dhabi Police RCT — group reading</w:t>
+            </w:r>
+          </w:p>
+        </w:tc>
+        <w:tc>
+          <w:tcPr>
+            <w:tcW w:type="dxa" w:w="2280"/>
+          </w:tcPr>
+          <w:p>
+            <w:r>
+              <w:t>~0:58–1:03 · Section 6</w:t>
+            </w:r>
+          </w:p>
+        </w:tc>
+        <w:tc>
+          <w:tcPr>
+            <w:tcW w:type="dxa" w:w="2280"/>
+          </w:tcPr>
+          <w:p>
+            <w:r>
+              <w:t>Group work + report-back</w:t>
+            </w:r>
+          </w:p>
+        </w:tc>
+        <w:tc>
+          <w:tcPr>
+            <w:tcW w:type="dxa" w:w="2280"/>
+          </w:tcPr>
+          <w:p>
+            <w:r>
+              <w:t>Police case handout (balance table + estimate + case facts) — pending real Police findings</w:t>
+            </w:r>
+          </w:p>
+        </w:tc>
+        <w:tc>
+          <w:tcPr>
+            <w:tcW w:type="dxa" w:w="2280"/>
+          </w:tcPr>
+          <w:p>
+            <w:r>
+              <w:t>Groups read the randomised result in three steps (balance / which number is the impact / does it clear the 1,000 AED rule), then a report-back with a confidence verdict and “one question for the evaluator.” Partner: build once the Police data arrives; structure mirrors the GreenWaste reading. Placeholder currently in the slides.</w:t>
+            </w:r>
+          </w:p>
+        </w:tc>
+        <w:tc>
+          <w:tcPr>
+            <w:tcW w:type="dxa" w:w="2280"/>
+          </w:tcPr>
+          <w:p>
+            <w:r>
+              <w:t>PLACEHOLDER — awaiting Police data</w:t>
+            </w:r>
+          </w:p>
+        </w:tc>
+      </w:tr>
+      <w:tr>
+        <w:tc>
+          <w:tcPr>
+            <w:tcW w:type="dxa" w:w="2280"/>
+          </w:tcPr>
+          <w:p>
+            <w:r>
+              <w:t>Closing “three questions” take-away card</w:t>
+            </w:r>
+          </w:p>
+        </w:tc>
+        <w:tc>
+          <w:tcPr>
+            <w:tcW w:type="dxa" w:w="2280"/>
+          </w:tcPr>
+          <w:p>
+            <w:r>
+              <w:t>~1:04 · Section 7, closing slide</w:t>
+            </w:r>
+          </w:p>
+        </w:tc>
+        <w:tc>
+          <w:tcPr>
+            <w:tcW w:type="dxa" w:w="2280"/>
+          </w:tcPr>
+          <w:p>
+            <w:r>
+              <w:t>Handout (take-away)</w:t>
+            </w:r>
+          </w:p>
+        </w:tc>
+        <w:tc>
+          <w:tcPr>
+            <w:tcW w:type="dxa" w:w="2280"/>
+          </w:tcPr>
+          <w:p>
+            <w:r>
+              <w:t>Printed pocket card, one per participant</w:t>
+            </w:r>
+          </w:p>
+        </w:tc>
+        <w:tc>
+          <w:tcPr>
+            <w:tcW w:type="dxa" w:w="2280"/>
+          </w:tcPr>
+          <w:p>
+            <w:r>
+              <w:t>A small take-away card with the three questions to ask any evaluator: compared to what? how do you know the groups started out alike? does it clear our decision rule, not just zero? Mirrors the closing slide. Optional.</w:t>
+            </w:r>
+          </w:p>
+        </w:tc>
+        <w:tc>
+          <w:tcPr>
+            <w:tcW w:type="dxa" w:w="2280"/>
+          </w:tcPr>
+          <w:p>
+            <w:r>
+              <w:t>Handout (optional)</w:t>
             </w:r>
           </w:p>
         </w:tc>

</xml_diff>

<commit_message>
new sessions and exercises
</commit_message>
<xml_diff>
--- a/Module_2_Oct_2026/Module2_exercise_plan.docx
+++ b/Module_2_Oct_2026/Module2_exercise_plan.docx
@@ -2382,6 +2382,1179 @@
     </w:tbl>
     <w:p>
       <w:pPr>
+        <w:pStyle w:val="Heading1"/>
+        <w:spacing w:after="80" w:before="120"/>
+      </w:pPr>
+      <w:r>
+        <w:rPr>
+          <w:b/>
+          <w:bCs/>
+        </w:rPr>
+        <w:t>Oct 13, Session 2 — Reading RDD Results (Abu Dhabi DCD)</w:t>
+      </w:r>
+    </w:p>
+    <w:tbl>
+      <w:tblPr>
+        <w:tblW w:type="dxa" w:w="12960"/>
+        <w:tblBorders>
+          <w:top w:val="single" w:color="auto" w:sz="4"/>
+          <w:left w:val="single" w:color="auto" w:sz="4"/>
+          <w:bottom w:val="single" w:color="auto" w:sz="4"/>
+          <w:right w:val="single" w:color="auto" w:sz="4"/>
+          <w:insideH w:val="single" w:color="auto" w:sz="4"/>
+          <w:insideV w:val="single" w:color="auto" w:sz="4"/>
+        </w:tblBorders>
+      </w:tblPr>
+      <w:tblGrid>
+        <w:gridCol w:w="2200"/>
+        <w:gridCol w:w="1700"/>
+        <w:gridCol w:w="1400"/>
+        <w:gridCol w:w="3000"/>
+        <w:gridCol w:w="3660"/>
+        <w:gridCol w:w="1000"/>
+      </w:tblGrid>
+      <w:tr>
+        <w:trPr>
+          <w:tblHeader/>
+        </w:trPr>
+        <w:tc>
+          <w:tcPr>
+            <w:tcW w:type="dxa" w:w="2200"/>
+            <w:shd w:fill="00789E" w:color="auto" w:val="clear"/>
+            <w:tcMar>
+              <w:top w:type="dxa" w:w="40"/>
+              <w:left w:type="dxa" w:w="80"/>
+              <w:bottom w:type="dxa" w:w="40"/>
+              <w:right w:type="dxa" w:w="80"/>
+            </w:tcMar>
+          </w:tcPr>
+          <w:p>
+            <w:pPr>
+              <w:spacing w:after="20"/>
+              <w:jc w:val="left"/>
+            </w:pPr>
+            <w:r>
+              <w:rPr>
+                <w:b/>
+                <w:bCs/>
+                <w:color w:val="FFFFFF"/>
+                <w:sz w:val="18"/>
+                <w:szCs w:val="18"/>
+              </w:rPr>
+              <w:t>Exercise</w:t>
+            </w:r>
+          </w:p>
+        </w:tc>
+        <w:tc>
+          <w:tcPr>
+            <w:tcW w:type="dxa" w:w="1700"/>
+            <w:shd w:fill="00789E" w:color="auto" w:val="clear"/>
+            <w:tcMar>
+              <w:top w:type="dxa" w:w="40"/>
+              <w:left w:type="dxa" w:w="80"/>
+              <w:bottom w:type="dxa" w:w="40"/>
+              <w:right w:type="dxa" w:w="80"/>
+            </w:tcMar>
+          </w:tcPr>
+          <w:p>
+            <w:pPr>
+              <w:spacing w:after="20"/>
+              <w:jc w:val="left"/>
+            </w:pPr>
+            <w:r>
+              <w:rPr>
+                <w:b/>
+                <w:bCs/>
+                <w:color w:val="FFFFFF"/>
+                <w:sz w:val="18"/>
+                <w:szCs w:val="18"/>
+              </w:rPr>
+              <w:t>When (approx.)</w:t>
+            </w:r>
+          </w:p>
+        </w:tc>
+        <w:tc>
+          <w:tcPr>
+            <w:tcW w:type="dxa" w:w="1400"/>
+            <w:shd w:fill="00789E" w:color="auto" w:val="clear"/>
+            <w:tcMar>
+              <w:top w:type="dxa" w:w="40"/>
+              <w:left w:type="dxa" w:w="80"/>
+              <w:bottom w:type="dxa" w:w="40"/>
+              <w:right w:type="dxa" w:w="80"/>
+            </w:tcMar>
+          </w:tcPr>
+          <w:p>
+            <w:pPr>
+              <w:spacing w:after="20"/>
+              <w:jc w:val="left"/>
+            </w:pPr>
+            <w:r>
+              <w:rPr>
+                <w:b/>
+                <w:bCs/>
+                <w:color w:val="FFFFFF"/>
+                <w:sz w:val="18"/>
+                <w:szCs w:val="18"/>
+              </w:rPr>
+              <w:t>Type</w:t>
+            </w:r>
+          </w:p>
+        </w:tc>
+        <w:tc>
+          <w:tcPr>
+            <w:tcW w:type="dxa" w:w="3000"/>
+            <w:shd w:fill="00789E" w:color="auto" w:val="clear"/>
+            <w:tcMar>
+              <w:top w:type="dxa" w:w="40"/>
+              <w:left w:type="dxa" w:w="80"/>
+              <w:bottom w:type="dxa" w:w="40"/>
+              <w:right w:type="dxa" w:w="80"/>
+            </w:tcMar>
+          </w:tcPr>
+          <w:p>
+            <w:pPr>
+              <w:spacing w:after="20"/>
+              <w:jc w:val="left"/>
+            </w:pPr>
+            <w:r>
+              <w:rPr>
+                <w:b/>
+                <w:bCs/>
+                <w:color w:val="FFFFFF"/>
+                <w:sz w:val="18"/>
+                <w:szCs w:val="18"/>
+              </w:rPr>
+              <w:t>Materials needed</w:t>
+            </w:r>
+          </w:p>
+        </w:tc>
+        <w:tc>
+          <w:tcPr>
+            <w:tcW w:type="dxa" w:w="3660"/>
+            <w:shd w:fill="00789E" w:color="auto" w:val="clear"/>
+            <w:tcMar>
+              <w:top w:type="dxa" w:w="40"/>
+              <w:left w:type="dxa" w:w="80"/>
+              <w:bottom w:type="dxa" w:w="40"/>
+              <w:right w:type="dxa" w:w="80"/>
+            </w:tcMar>
+          </w:tcPr>
+          <w:p>
+            <w:pPr>
+              <w:spacing w:after="20"/>
+              <w:jc w:val="left"/>
+            </w:pPr>
+            <w:r>
+              <w:rPr>
+                <w:b/>
+                <w:bCs/>
+                <w:color w:val="FFFFFF"/>
+                <w:sz w:val="18"/>
+                <w:szCs w:val="18"/>
+              </w:rPr>
+              <w:t>What the partner builds / needs to know</w:t>
+            </w:r>
+          </w:p>
+        </w:tc>
+        <w:tc>
+          <w:tcPr>
+            <w:tcW w:type="dxa" w:w="1000"/>
+            <w:shd w:fill="00789E" w:color="auto" w:val="clear"/>
+            <w:tcMar>
+              <w:top w:type="dxa" w:w="40"/>
+              <w:left w:type="dxa" w:w="80"/>
+              <w:bottom w:type="dxa" w:w="40"/>
+              <w:right w:type="dxa" w:w="80"/>
+            </w:tcMar>
+          </w:tcPr>
+          <w:p>
+            <w:pPr>
+              <w:spacing w:after="20"/>
+              <w:jc w:val="left"/>
+            </w:pPr>
+            <w:r>
+              <w:rPr>
+                <w:b/>
+                <w:bCs/>
+                <w:color w:val="FFFFFF"/>
+                <w:sz w:val="18"/>
+                <w:szCs w:val="18"/>
+              </w:rPr>
+              <w:t>Status</w:t>
+            </w:r>
+          </w:p>
+        </w:tc>
+      </w:tr>
+      <w:tr>
+        <w:tc>
+          <w:tcPr>
+            <w:tcW w:type="dxa" w:w="2200"/>
+            <w:tcMar>
+              <w:top w:type="dxa" w:w="40"/>
+              <w:left w:type="dxa" w:w="80"/>
+              <w:bottom w:type="dxa" w:w="40"/>
+              <w:right w:type="dxa" w:w="80"/>
+            </w:tcMar>
+          </w:tcPr>
+          <w:p>
+            <w:pPr>
+              <w:spacing w:after="20"/>
+              <w:jc w:val="left"/>
+            </w:pPr>
+            <w:r>
+              <w:rPr>
+                <w:b/>
+                <w:bCs/>
+                <w:sz w:val="18"/>
+                <w:szCs w:val="18"/>
+              </w:rPr>
+              <w:t>Trap vote — the whole-market gap</w:t>
+            </w:r>
+          </w:p>
+        </w:tc>
+        <w:tc>
+          <w:tcPr>
+            <w:tcW w:type="dxa" w:w="1700"/>
+            <w:tcMar>
+              <w:top w:type="dxa" w:w="40"/>
+              <w:left w:type="dxa" w:w="80"/>
+              <w:bottom w:type="dxa" w:w="40"/>
+              <w:right w:type="dxa" w:w="80"/>
+            </w:tcMar>
+          </w:tcPr>
+          <w:p>
+            <w:pPr>
+              <w:spacing w:after="20"/>
+              <w:jc w:val="left"/>
+            </w:pPr>
+            <w:r>
+              <w:rPr>
+                <w:b w:val="false"/>
+                <w:bCs w:val="false"/>
+                <w:sz w:val="18"/>
+                <w:szCs w:val="18"/>
+              </w:rPr>
+              <w:t>~0:04 · Section 1, slide 'A convincing comparison'</w:t>
+            </w:r>
+          </w:p>
+        </w:tc>
+        <w:tc>
+          <w:tcPr>
+            <w:tcW w:type="dxa" w:w="1400"/>
+            <w:tcMar>
+              <w:top w:type="dxa" w:w="40"/>
+              <w:left w:type="dxa" w:w="80"/>
+              <w:bottom w:type="dxa" w:w="40"/>
+              <w:right w:type="dxa" w:w="80"/>
+            </w:tcMar>
+          </w:tcPr>
+          <w:p>
+            <w:pPr>
+              <w:spacing w:after="20"/>
+              <w:jc w:val="left"/>
+            </w:pPr>
+            <w:r>
+              <w:rPr>
+                <w:b w:val="false"/>
+                <w:bCs w:val="false"/>
+                <w:sz w:val="18"/>
+                <w:szCs w:val="18"/>
+              </w:rPr>
+              <w:t>Live vote (hands or Menti)</w:t>
+            </w:r>
+          </w:p>
+        </w:tc>
+        <w:tc>
+          <w:tcPr>
+            <w:tcW w:type="dxa" w:w="3000"/>
+            <w:tcMar>
+              <w:top w:type="dxa" w:w="40"/>
+              <w:left w:type="dxa" w:w="80"/>
+              <w:bottom w:type="dxa" w:w="40"/>
+              <w:right w:type="dxa" w:w="80"/>
+            </w:tcMar>
+          </w:tcPr>
+          <w:p>
+            <w:pPr>
+              <w:spacing w:after="20"/>
+              <w:jc w:val="left"/>
+            </w:pPr>
+            <w:r>
+              <w:rPr>
+                <w:b w:val="false"/>
+                <w:bCs w:val="false"/>
+                <w:sz w:val="18"/>
+                <w:szCs w:val="18"/>
+              </w:rPr>
+              <w:t>Flipchart to record the count, or an optional Menti poll</w:t>
+            </w:r>
+          </w:p>
+        </w:tc>
+        <w:tc>
+          <w:tcPr>
+            <w:tcW w:type="dxa" w:w="3660"/>
+            <w:tcMar>
+              <w:top w:type="dxa" w:w="40"/>
+              <w:left w:type="dxa" w:w="80"/>
+              <w:bottom w:type="dxa" w:w="40"/>
+              <w:right w:type="dxa" w:w="80"/>
+            </w:tcMar>
+          </w:tcPr>
+          <w:p>
+            <w:pPr>
+              <w:spacing w:after="20"/>
+              <w:jc w:val="left"/>
+            </w:pPr>
+            <w:r>
+              <w:rPr>
+                <w:b w:val="false"/>
+                <w:bCs w:val="false"/>
+                <w:sz w:val="18"/>
+                <w:szCs w:val="18"/>
+              </w:rPr>
+              <w:t>A question put to the room before the reveal: 'Businesses offered the programme spend less than those not offered. Did the programme cause that gap, and how big is the effect?' The room commits to an answer, then the next slide shows the two sides differ across the whole index. Partner: optionally build a simple Menti poll (Yes, it caused it / No / Can't tell) so the room sees the count shift; low-tech hands are also fine.</w:t>
+            </w:r>
+          </w:p>
+        </w:tc>
+        <w:tc>
+          <w:tcPr>
+            <w:tcW w:type="dxa" w:w="1000"/>
+            <w:tcMar>
+              <w:top w:type="dxa" w:w="40"/>
+              <w:left w:type="dxa" w:w="80"/>
+              <w:bottom w:type="dxa" w:w="40"/>
+              <w:right w:type="dxa" w:w="80"/>
+            </w:tcMar>
+          </w:tcPr>
+          <w:p>
+            <w:pPr>
+              <w:spacing w:after="20"/>
+              <w:jc w:val="left"/>
+            </w:pPr>
+            <w:r>
+              <w:rPr>
+                <w:b w:val="false"/>
+                <w:bCs w:val="false"/>
+                <w:sz w:val="18"/>
+                <w:szCs w:val="18"/>
+              </w:rPr>
+              <w:t>In slides (hands); Menti optional</w:t>
+            </w:r>
+          </w:p>
+        </w:tc>
+      </w:tr>
+      <w:tr>
+        <w:tc>
+          <w:tcPr>
+            <w:tcW w:type="dxa" w:w="2200"/>
+            <w:shd w:fill="F4F6F7" w:color="auto" w:val="clear"/>
+            <w:tcMar>
+              <w:top w:type="dxa" w:w="40"/>
+              <w:left w:type="dxa" w:w="80"/>
+              <w:bottom w:type="dxa" w:w="40"/>
+              <w:right w:type="dxa" w:w="80"/>
+            </w:tcMar>
+          </w:tcPr>
+          <w:p>
+            <w:pPr>
+              <w:spacing w:after="20"/>
+              <w:jc w:val="left"/>
+            </w:pPr>
+            <w:r>
+              <w:rPr>
+                <w:b/>
+                <w:bCs/>
+                <w:sz w:val="18"/>
+                <w:szCs w:val="18"/>
+              </w:rPr>
+              <w:t>By-hand jump — narrow-band averages</w:t>
+            </w:r>
+          </w:p>
+        </w:tc>
+        <w:tc>
+          <w:tcPr>
+            <w:tcW w:type="dxa" w:w="1700"/>
+            <w:shd w:fill="F4F6F7" w:color="auto" w:val="clear"/>
+            <w:tcMar>
+              <w:top w:type="dxa" w:w="40"/>
+              <w:left w:type="dxa" w:w="80"/>
+              <w:bottom w:type="dxa" w:w="40"/>
+              <w:right w:type="dxa" w:w="80"/>
+            </w:tcMar>
+          </w:tcPr>
+          <w:p>
+            <w:pPr>
+              <w:spacing w:after="20"/>
+              <w:jc w:val="left"/>
+            </w:pPr>
+            <w:r>
+              <w:rPr>
+                <w:b w:val="false"/>
+                <w:bCs w:val="false"/>
+                <w:sz w:val="18"/>
+                <w:szCs w:val="18"/>
+              </w:rPr>
+              <w:t>~0:11 · Section 2, slide 'Your turn: the jump by hand'</w:t>
+            </w:r>
+          </w:p>
+        </w:tc>
+        <w:tc>
+          <w:tcPr>
+            <w:tcW w:type="dxa" w:w="1400"/>
+            <w:shd w:fill="F4F6F7" w:color="auto" w:val="clear"/>
+            <w:tcMar>
+              <w:top w:type="dxa" w:w="40"/>
+              <w:left w:type="dxa" w:w="80"/>
+              <w:bottom w:type="dxa" w:w="40"/>
+              <w:right w:type="dxa" w:w="80"/>
+            </w:tcMar>
+          </w:tcPr>
+          <w:p>
+            <w:pPr>
+              <w:spacing w:after="20"/>
+              <w:jc w:val="left"/>
+            </w:pPr>
+            <w:r>
+              <w:rPr>
+                <w:b w:val="false"/>
+                <w:bCs w:val="false"/>
+                <w:sz w:val="18"/>
+                <w:szCs w:val="18"/>
+              </w:rPr>
+              <w:t>Individual / pairs hands-on (printed card)</w:t>
+            </w:r>
+          </w:p>
+        </w:tc>
+        <w:tc>
+          <w:tcPr>
+            <w:tcW w:type="dxa" w:w="3000"/>
+            <w:shd w:fill="F4F6F7" w:color="auto" w:val="clear"/>
+            <w:tcMar>
+              <w:top w:type="dxa" w:w="40"/>
+              <w:left w:type="dxa" w:w="80"/>
+              <w:bottom w:type="dxa" w:w="40"/>
+              <w:right w:type="dxa" w:w="80"/>
+            </w:tcMar>
+          </w:tcPr>
+          <w:p>
+            <w:pPr>
+              <w:spacing w:after="20"/>
+              <w:jc w:val="left"/>
+            </w:pPr>
+            <w:r>
+              <w:rPr>
+                <w:b w:val="false"/>
+                <w:bCs w:val="false"/>
+                <w:sz w:val="18"/>
+                <w:szCs w:val="18"/>
+              </w:rPr>
+              <w:t>Printed 'narrow-band' card, one per participant or pair</w:t>
+            </w:r>
+          </w:p>
+        </w:tc>
+        <w:tc>
+          <w:tcPr>
+            <w:tcW w:type="dxa" w:w="3660"/>
+            <w:shd w:fill="F4F6F7" w:color="auto" w:val="clear"/>
+            <w:tcMar>
+              <w:top w:type="dxa" w:w="40"/>
+              <w:left w:type="dxa" w:w="80"/>
+              <w:bottom w:type="dxa" w:w="40"/>
+              <w:right w:type="dxa" w:w="80"/>
+            </w:tcMar>
+          </w:tcPr>
+          <w:p>
+            <w:pPr>
+              <w:spacing w:after="20"/>
+              <w:jc w:val="left"/>
+            </w:pPr>
+            <w:r>
+              <w:rPr>
+                <w:b w:val="false"/>
+                <w:bCs w:val="false"/>
+                <w:sz w:val="18"/>
+                <w:szCs w:val="18"/>
+              </w:rPr>
+              <w:t>Participants estimate the RDD jump by hand: average the costs of businesses just below the cut-off (scores 55–58, offered) and just above it (59–62, not offered), then subtract. Partner: design a one-page card mirroring the slide's table (Just below / Just above / Difference) with space to write the two averages and their difference, plus a short list of about 10–12 example businesses on each side (efficiency score and waste cost) for participants to average so they land near the class figure. Fiona to supply the example rows from the data.</w:t>
+            </w:r>
+          </w:p>
+        </w:tc>
+        <w:tc>
+          <w:tcPr>
+            <w:tcW w:type="dxa" w:w="1000"/>
+            <w:shd w:fill="F4F6F7" w:color="auto" w:val="clear"/>
+            <w:tcMar>
+              <w:top w:type="dxa" w:w="40"/>
+              <w:left w:type="dxa" w:w="80"/>
+              <w:bottom w:type="dxa" w:w="40"/>
+              <w:right w:type="dxa" w:w="80"/>
+            </w:tcMar>
+          </w:tcPr>
+          <w:p>
+            <w:pPr>
+              <w:spacing w:after="20"/>
+              <w:jc w:val="left"/>
+            </w:pPr>
+            <w:r>
+              <w:rPr>
+                <w:b w:val="false"/>
+                <w:bCs w:val="false"/>
+                <w:sz w:val="18"/>
+                <w:szCs w:val="18"/>
+              </w:rPr>
+              <w:t>Handout to build (needs example rows from Fiona)</w:t>
+            </w:r>
+          </w:p>
+        </w:tc>
+      </w:tr>
+      <w:tr>
+        <w:tc>
+          <w:tcPr>
+            <w:tcW w:type="dxa" w:w="2200"/>
+            <w:tcMar>
+              <w:top w:type="dxa" w:w="40"/>
+              <w:left w:type="dxa" w:w="80"/>
+              <w:bottom w:type="dxa" w:w="40"/>
+              <w:right w:type="dxa" w:w="80"/>
+            </w:tcMar>
+          </w:tcPr>
+          <w:p>
+            <w:pPr>
+              <w:spacing w:after="20"/>
+              <w:jc w:val="left"/>
+            </w:pPr>
+            <w:r>
+              <w:rPr>
+                <w:b/>
+                <w:bCs/>
+                <w:sz w:val="18"/>
+                <w:szCs w:val="18"/>
+              </w:rPr>
+              <w:t>Which row is the effect? — coefficient vote</w:t>
+            </w:r>
+          </w:p>
+        </w:tc>
+        <w:tc>
+          <w:tcPr>
+            <w:tcW w:type="dxa" w:w="1700"/>
+            <w:tcMar>
+              <w:top w:type="dxa" w:w="40"/>
+              <w:left w:type="dxa" w:w="80"/>
+              <w:bottom w:type="dxa" w:w="40"/>
+              <w:right w:type="dxa" w:w="80"/>
+            </w:tcMar>
+          </w:tcPr>
+          <w:p>
+            <w:pPr>
+              <w:spacing w:after="20"/>
+              <w:jc w:val="left"/>
+            </w:pPr>
+            <w:r>
+              <w:rPr>
+                <w:b w:val="false"/>
+                <w:bCs w:val="false"/>
+                <w:sz w:val="18"/>
+                <w:szCs w:val="18"/>
+              </w:rPr>
+              <w:t>~0:22 · Section 3, slide 'Running the regression'</w:t>
+            </w:r>
+          </w:p>
+        </w:tc>
+        <w:tc>
+          <w:tcPr>
+            <w:tcW w:type="dxa" w:w="1400"/>
+            <w:tcMar>
+              <w:top w:type="dxa" w:w="40"/>
+              <w:left w:type="dxa" w:w="80"/>
+              <w:bottom w:type="dxa" w:w="40"/>
+              <w:right w:type="dxa" w:w="80"/>
+            </w:tcMar>
+          </w:tcPr>
+          <w:p>
+            <w:pPr>
+              <w:spacing w:after="20"/>
+              <w:jc w:val="left"/>
+            </w:pPr>
+            <w:r>
+              <w:rPr>
+                <w:b w:val="false"/>
+                <w:bCs w:val="false"/>
+                <w:sz w:val="18"/>
+                <w:szCs w:val="18"/>
+              </w:rPr>
+              <w:t>Live vote (hands or Menti)</w:t>
+            </w:r>
+          </w:p>
+        </w:tc>
+        <w:tc>
+          <w:tcPr>
+            <w:tcW w:type="dxa" w:w="3000"/>
+            <w:tcMar>
+              <w:top w:type="dxa" w:w="40"/>
+              <w:left w:type="dxa" w:w="80"/>
+              <w:bottom w:type="dxa" w:w="40"/>
+              <w:right w:type="dxa" w:w="80"/>
+            </w:tcMar>
+          </w:tcPr>
+          <w:p>
+            <w:pPr>
+              <w:spacing w:after="20"/>
+              <w:jc w:val="left"/>
+            </w:pPr>
+            <w:r>
+              <w:rPr>
+                <w:b w:val="false"/>
+                <w:bCs w:val="false"/>
+                <w:sz w:val="18"/>
+                <w:szCs w:val="18"/>
+              </w:rPr>
+              <w:t>None, or an optional Menti poll listing the four coefficient rows</w:t>
+            </w:r>
+          </w:p>
+        </w:tc>
+        <w:tc>
+          <w:tcPr>
+            <w:tcW w:type="dxa" w:w="3660"/>
+            <w:tcMar>
+              <w:top w:type="dxa" w:w="40"/>
+              <w:left w:type="dxa" w:w="80"/>
+              <w:bottom w:type="dxa" w:w="40"/>
+              <w:right w:type="dxa" w:w="80"/>
+            </w:tcMar>
+          </w:tcPr>
+          <w:p>
+            <w:pPr>
+              <w:spacing w:after="20"/>
+              <w:jc w:val="left"/>
+            </w:pPr>
+            <w:r>
+              <w:rPr>
+                <w:b w:val="false"/>
+                <w:bCs w:val="false"/>
+                <w:sz w:val="18"/>
+                <w:szCs w:val="18"/>
+              </w:rPr>
+              <w:t>After the regression table appears, the room votes on which of the four rows (Intercept, c0 slope, enrolled, c0:enrolled) is the programme's effect, before the reveal on the following slides. Partner: optionally build a Menti poll with the four rows so the count shows live.</w:t>
+            </w:r>
+          </w:p>
+        </w:tc>
+        <w:tc>
+          <w:tcPr>
+            <w:tcW w:type="dxa" w:w="1000"/>
+            <w:tcMar>
+              <w:top w:type="dxa" w:w="40"/>
+              <w:left w:type="dxa" w:w="80"/>
+              <w:bottom w:type="dxa" w:w="40"/>
+              <w:right w:type="dxa" w:w="80"/>
+            </w:tcMar>
+          </w:tcPr>
+          <w:p>
+            <w:pPr>
+              <w:spacing w:after="20"/>
+              <w:jc w:val="left"/>
+            </w:pPr>
+            <w:r>
+              <w:rPr>
+                <w:b w:val="false"/>
+                <w:bCs w:val="false"/>
+                <w:sz w:val="18"/>
+                <w:szCs w:val="18"/>
+              </w:rPr>
+              <w:t>In slides (hands); Menti optional</w:t>
+            </w:r>
+          </w:p>
+        </w:tc>
+      </w:tr>
+      <w:tr>
+        <w:tc>
+          <w:tcPr>
+            <w:tcW w:type="dxa" w:w="2200"/>
+            <w:shd w:fill="F4F6F7" w:color="auto" w:val="clear"/>
+            <w:tcMar>
+              <w:top w:type="dxa" w:w="40"/>
+              <w:left w:type="dxa" w:w="80"/>
+              <w:bottom w:type="dxa" w:w="40"/>
+              <w:right w:type="dxa" w:w="80"/>
+            </w:tcMar>
+          </w:tcPr>
+          <w:p>
+            <w:pPr>
+              <w:spacing w:after="20"/>
+              <w:jc w:val="left"/>
+            </w:pPr>
+            <w:r>
+              <w:rPr>
+                <w:b/>
+                <w:bCs/>
+                <w:sz w:val="18"/>
+                <w:szCs w:val="18"/>
+              </w:rPr>
+              <w:t>AI Snapshot — mark up the flawed response</w:t>
+            </w:r>
+          </w:p>
+        </w:tc>
+        <w:tc>
+          <w:tcPr>
+            <w:tcW w:type="dxa" w:w="1700"/>
+            <w:shd w:fill="F4F6F7" w:color="auto" w:val="clear"/>
+            <w:tcMar>
+              <w:top w:type="dxa" w:w="40"/>
+              <w:left w:type="dxa" w:w="80"/>
+              <w:bottom w:type="dxa" w:w="40"/>
+              <w:right w:type="dxa" w:w="80"/>
+            </w:tcMar>
+          </w:tcPr>
+          <w:p>
+            <w:pPr>
+              <w:spacing w:after="20"/>
+              <w:jc w:val="left"/>
+            </w:pPr>
+            <w:r>
+              <w:rPr>
+                <w:b w:val="false"/>
+                <w:bCs w:val="false"/>
+                <w:sz w:val="18"/>
+                <w:szCs w:val="18"/>
+              </w:rPr>
+              <w:t>~0:38 · Section 5, slide 'Feeding the RDD table to AI'</w:t>
+            </w:r>
+          </w:p>
+        </w:tc>
+        <w:tc>
+          <w:tcPr>
+            <w:tcW w:type="dxa" w:w="1400"/>
+            <w:shd w:fill="F4F6F7" w:color="auto" w:val="clear"/>
+            <w:tcMar>
+              <w:top w:type="dxa" w:w="40"/>
+              <w:left w:type="dxa" w:w="80"/>
+              <w:bottom w:type="dxa" w:w="40"/>
+              <w:right w:type="dxa" w:w="80"/>
+            </w:tcMar>
+          </w:tcPr>
+          <w:p>
+            <w:pPr>
+              <w:spacing w:after="20"/>
+              <w:jc w:val="left"/>
+            </w:pPr>
+            <w:r>
+              <w:rPr>
+                <w:b w:val="false"/>
+                <w:bCs w:val="false"/>
+                <w:sz w:val="18"/>
+                <w:szCs w:val="18"/>
+              </w:rPr>
+              <w:t>Small-group hands-on (printed handout)</w:t>
+            </w:r>
+          </w:p>
+        </w:tc>
+        <w:tc>
+          <w:tcPr>
+            <w:tcW w:type="dxa" w:w="3000"/>
+            <w:shd w:fill="F4F6F7" w:color="auto" w:val="clear"/>
+            <w:tcMar>
+              <w:top w:type="dxa" w:w="40"/>
+              <w:left w:type="dxa" w:w="80"/>
+              <w:bottom w:type="dxa" w:w="40"/>
+              <w:right w:type="dxa" w:w="80"/>
+            </w:tcMar>
+          </w:tcPr>
+          <w:p>
+            <w:pPr>
+              <w:spacing w:after="20"/>
+              <w:jc w:val="left"/>
+            </w:pPr>
+            <w:r>
+              <w:rPr>
+                <w:b w:val="false"/>
+                <w:bCs w:val="false"/>
+                <w:sz w:val="18"/>
+                <w:szCs w:val="18"/>
+              </w:rPr>
+              <w:t>Printed copy of the AI response, one per group, with room to annotate</w:t>
+            </w:r>
+          </w:p>
+        </w:tc>
+        <w:tc>
+          <w:tcPr>
+            <w:tcW w:type="dxa" w:w="3660"/>
+            <w:shd w:fill="F4F6F7" w:color="auto" w:val="clear"/>
+            <w:tcMar>
+              <w:top w:type="dxa" w:w="40"/>
+              <w:left w:type="dxa" w:w="80"/>
+              <w:bottom w:type="dxa" w:w="40"/>
+              <w:right w:type="dxa" w:w="80"/>
+            </w:tcMar>
+          </w:tcPr>
+          <w:p>
+            <w:pPr>
+              <w:spacing w:after="20"/>
+              <w:jc w:val="left"/>
+            </w:pPr>
+            <w:r>
+              <w:rPr>
+                <w:b w:val="false"/>
+                <w:bCs w:val="false"/>
+                <w:sz w:val="18"/>
+                <w:szCs w:val="18"/>
+              </w:rPr>
+              <w:t>Groups read a sample AI answer to 'Explain these results' and mark anything that looks wrong. Partner: print the AI response text shown on the slide as a clean handout with margins for annotation. There are four planted issues (a local result stated as national, the slope read as the effect, the decision rule ignored, and an invented p-value) but do not print the number; let groups find what they can. A real captured example will replace the invented one once Fiona tests the prompt.</w:t>
+            </w:r>
+          </w:p>
+        </w:tc>
+        <w:tc>
+          <w:tcPr>
+            <w:tcW w:type="dxa" w:w="1000"/>
+            <w:shd w:fill="F4F6F7" w:color="auto" w:val="clear"/>
+            <w:tcMar>
+              <w:top w:type="dxa" w:w="40"/>
+              <w:left w:type="dxa" w:w="80"/>
+              <w:bottom w:type="dxa" w:w="40"/>
+              <w:right w:type="dxa" w:w="80"/>
+            </w:tcMar>
+          </w:tcPr>
+          <w:p>
+            <w:pPr>
+              <w:spacing w:after="20"/>
+              <w:jc w:val="left"/>
+            </w:pPr>
+            <w:r>
+              <w:rPr>
+                <w:b w:val="false"/>
+                <w:bCs w:val="false"/>
+                <w:sz w:val="18"/>
+                <w:szCs w:val="18"/>
+              </w:rPr>
+              <w:t>Handout to build (real capture to be swapped in)</w:t>
+            </w:r>
+          </w:p>
+        </w:tc>
+      </w:tr>
+      <w:tr>
+        <w:tc>
+          <w:tcPr>
+            <w:tcW w:type="dxa" w:w="2200"/>
+            <w:tcMar>
+              <w:top w:type="dxa" w:w="40"/>
+              <w:left w:type="dxa" w:w="80"/>
+              <w:bottom w:type="dxa" w:w="40"/>
+              <w:right w:type="dxa" w:w="80"/>
+            </w:tcMar>
+          </w:tcPr>
+          <w:p>
+            <w:pPr>
+              <w:spacing w:after="20"/>
+              <w:jc w:val="left"/>
+            </w:pPr>
+            <w:r>
+              <w:rPr>
+                <w:b/>
+                <w:bCs/>
+                <w:sz w:val="18"/>
+                <w:szCs w:val="18"/>
+              </w:rPr>
+              <w:t>AI Snapshot — bad prompt vs good prompt + fresh-chat review</w:t>
+            </w:r>
+          </w:p>
+        </w:tc>
+        <w:tc>
+          <w:tcPr>
+            <w:tcW w:type="dxa" w:w="1700"/>
+            <w:tcMar>
+              <w:top w:type="dxa" w:w="40"/>
+              <w:left w:type="dxa" w:w="80"/>
+              <w:bottom w:type="dxa" w:w="40"/>
+              <w:right w:type="dxa" w:w="80"/>
+            </w:tcMar>
+          </w:tcPr>
+          <w:p>
+            <w:pPr>
+              <w:spacing w:after="20"/>
+              <w:jc w:val="left"/>
+            </w:pPr>
+            <w:r>
+              <w:rPr>
+                <w:b w:val="false"/>
+                <w:bCs w:val="false"/>
+                <w:sz w:val="18"/>
+                <w:szCs w:val="18"/>
+              </w:rPr>
+              <w:t>~0:44 · Section 5, slides 'The same table, a better prompt' and 'Your turn'</w:t>
+            </w:r>
+          </w:p>
+        </w:tc>
+        <w:tc>
+          <w:tcPr>
+            <w:tcW w:type="dxa" w:w="1400"/>
+            <w:tcMar>
+              <w:top w:type="dxa" w:w="40"/>
+              <w:left w:type="dxa" w:w="80"/>
+              <w:bottom w:type="dxa" w:w="40"/>
+              <w:right w:type="dxa" w:w="80"/>
+            </w:tcMar>
+          </w:tcPr>
+          <w:p>
+            <w:pPr>
+              <w:spacing w:after="20"/>
+              <w:jc w:val="left"/>
+            </w:pPr>
+            <w:r>
+              <w:rPr>
+                <w:b w:val="false"/>
+                <w:bCs w:val="false"/>
+                <w:sz w:val="18"/>
+                <w:szCs w:val="18"/>
+              </w:rPr>
+              <w:t>Small-group hands-on + AI (device per group)</w:t>
+            </w:r>
+          </w:p>
+        </w:tc>
+        <w:tc>
+          <w:tcPr>
+            <w:tcW w:type="dxa" w:w="3000"/>
+            <w:tcMar>
+              <w:top w:type="dxa" w:w="40"/>
+              <w:left w:type="dxa" w:w="80"/>
+              <w:bottom w:type="dxa" w:w="40"/>
+              <w:right w:type="dxa" w:w="80"/>
+            </w:tcMar>
+          </w:tcPr>
+          <w:p>
+            <w:pPr>
+              <w:spacing w:after="20"/>
+              <w:jc w:val="left"/>
+            </w:pPr>
+            <w:r>
+              <w:rPr>
+                <w:b w:val="false"/>
+                <w:bCs w:val="false"/>
+                <w:sz w:val="18"/>
+                <w:szCs w:val="18"/>
+              </w:rPr>
+              <w:t>Two printed prompt cards; a printed copy of the RDD results table; a device with AI access per group</w:t>
+            </w:r>
+          </w:p>
+        </w:tc>
+        <w:tc>
+          <w:tcPr>
+            <w:tcW w:type="dxa" w:w="3660"/>
+            <w:tcMar>
+              <w:top w:type="dxa" w:w="40"/>
+              <w:left w:type="dxa" w:w="80"/>
+              <w:bottom w:type="dxa" w:w="40"/>
+              <w:right w:type="dxa" w:w="80"/>
+            </w:tcMar>
+          </w:tcPr>
+          <w:p>
+            <w:pPr>
+              <w:spacing w:after="20"/>
+              <w:jc w:val="left"/>
+            </w:pPr>
+            <w:r>
+              <w:rPr>
+                <w:b w:val="false"/>
+                <w:bCs w:val="false"/>
+                <w:sz w:val="18"/>
+                <w:szCs w:val="18"/>
+              </w:rPr>
+              <w:t>Groups run both prompts on the same table: the short 'Explain these results' and the full commissioner prompt (which states the 1,000 AED decision rule, notes that the estimate is local, and asks the model to ask questions first), then paste the second answer into a fresh chat and ask it to review for errors and overstatement. Partner: design the two prompt cards (text is on the slides) and a printed RDD results table for groups to paste or attach.</w:t>
+            </w:r>
+          </w:p>
+        </w:tc>
+        <w:tc>
+          <w:tcPr>
+            <w:tcW w:type="dxa" w:w="1000"/>
+            <w:tcMar>
+              <w:top w:type="dxa" w:w="40"/>
+              <w:left w:type="dxa" w:w="80"/>
+              <w:bottom w:type="dxa" w:w="40"/>
+              <w:right w:type="dxa" w:w="80"/>
+            </w:tcMar>
+          </w:tcPr>
+          <w:p>
+            <w:pPr>
+              <w:spacing w:after="20"/>
+              <w:jc w:val="left"/>
+            </w:pPr>
+            <w:r>
+              <w:rPr>
+                <w:b w:val="false"/>
+                <w:bCs w:val="false"/>
+                <w:sz w:val="18"/>
+                <w:szCs w:val="18"/>
+              </w:rPr>
+              <w:t>Cards + table handout to build</w:t>
+            </w:r>
+          </w:p>
+        </w:tc>
+      </w:tr>
+      <w:tr>
+        <w:tc>
+          <w:tcPr>
+            <w:tcW w:type="dxa" w:w="2200"/>
+            <w:shd w:fill="F4F6F7" w:color="auto" w:val="clear"/>
+            <w:tcMar>
+              <w:top w:type="dxa" w:w="40"/>
+              <w:left w:type="dxa" w:w="80"/>
+              <w:bottom w:type="dxa" w:w="40"/>
+              <w:right w:type="dxa" w:w="80"/>
+            </w:tcMar>
+          </w:tcPr>
+          <w:p>
+            <w:pPr>
+              <w:spacing w:after="20"/>
+              <w:jc w:val="left"/>
+            </w:pPr>
+            <w:r>
+              <w:rPr>
+                <w:b/>
+                <w:bCs/>
+                <w:sz w:val="18"/>
+                <w:szCs w:val="18"/>
+              </w:rPr>
+              <w:t>Verdict round — the DCD case</w:t>
+            </w:r>
+          </w:p>
+        </w:tc>
+        <w:tc>
+          <w:tcPr>
+            <w:tcW w:type="dxa" w:w="1700"/>
+            <w:shd w:fill="F4F6F7" w:color="auto" w:val="clear"/>
+            <w:tcMar>
+              <w:top w:type="dxa" w:w="40"/>
+              <w:left w:type="dxa" w:w="80"/>
+              <w:bottom w:type="dxa" w:w="40"/>
+              <w:right w:type="dxa" w:w="80"/>
+            </w:tcMar>
+          </w:tcPr>
+          <w:p>
+            <w:pPr>
+              <w:spacing w:after="20"/>
+              <w:jc w:val="left"/>
+            </w:pPr>
+            <w:r>
+              <w:rPr>
+                <w:b w:val="false"/>
+                <w:bCs w:val="false"/>
+                <w:sz w:val="18"/>
+                <w:szCs w:val="18"/>
+              </w:rPr>
+              <w:t>~1:22 · Section 6, slide 'Read it, then decide' (placeholder)</w:t>
+            </w:r>
+          </w:p>
+        </w:tc>
+        <w:tc>
+          <w:tcPr>
+            <w:tcW w:type="dxa" w:w="1400"/>
+            <w:shd w:fill="F4F6F7" w:color="auto" w:val="clear"/>
+            <w:tcMar>
+              <w:top w:type="dxa" w:w="40"/>
+              <w:left w:type="dxa" w:w="80"/>
+              <w:bottom w:type="dxa" w:w="40"/>
+              <w:right w:type="dxa" w:w="80"/>
+            </w:tcMar>
+          </w:tcPr>
+          <w:p>
+            <w:pPr>
+              <w:spacing w:after="20"/>
+              <w:jc w:val="left"/>
+            </w:pPr>
+            <w:r>
+              <w:rPr>
+                <w:b w:val="false"/>
+                <w:bCs w:val="false"/>
+                <w:sz w:val="18"/>
+                <w:szCs w:val="18"/>
+              </w:rPr>
+              <w:t>Live vote (hands)</w:t>
+            </w:r>
+          </w:p>
+        </w:tc>
+        <w:tc>
+          <w:tcPr>
+            <w:tcW w:type="dxa" w:w="3000"/>
+            <w:shd w:fill="F4F6F7" w:color="auto" w:val="clear"/>
+            <w:tcMar>
+              <w:top w:type="dxa" w:w="40"/>
+              <w:left w:type="dxa" w:w="80"/>
+              <w:bottom w:type="dxa" w:w="40"/>
+              <w:right w:type="dxa" w:w="80"/>
+            </w:tcMar>
+          </w:tcPr>
+          <w:p>
+            <w:pPr>
+              <w:spacing w:after="20"/>
+              <w:jc w:val="left"/>
+            </w:pPr>
+            <w:r>
+              <w:rPr>
+                <w:b w:val="false"/>
+                <w:bCs w:val="false"/>
+                <w:sz w:val="18"/>
+                <w:szCs w:val="18"/>
+              </w:rPr>
+              <w:t>None (optional flipchart)</w:t>
+            </w:r>
+          </w:p>
+        </w:tc>
+        <w:tc>
+          <w:tcPr>
+            <w:tcW w:type="dxa" w:w="3660"/>
+            <w:shd w:fill="F4F6F7" w:color="auto" w:val="clear"/>
+            <w:tcMar>
+              <w:top w:type="dxa" w:w="40"/>
+              <w:left w:type="dxa" w:w="80"/>
+              <w:bottom w:type="dxa" w:w="40"/>
+              <w:right w:type="dxa" w:w="80"/>
+            </w:tcMar>
+          </w:tcPr>
+          <w:p>
+            <w:pPr>
+              <w:spacing w:after="20"/>
+              <w:jc w:val="left"/>
+            </w:pPr>
+            <w:r>
+              <w:rPr>
+                <w:b w:val="false"/>
+                <w:bCs w:val="false"/>
+                <w:sz w:val="18"/>
+                <w:szCs w:val="18"/>
+              </w:rPr>
+              <w:t>After reading the Abu Dhabi DCD RDD result, the room votes: act on it, act with caveats, or send it back. Partner: no build yet. This case is a placeholder awaiting the real DCD Social Protection findings; the exercise structure (read the table, then a three-way verdict) is final, so materials can be built once the data arrives.</w:t>
+            </w:r>
+          </w:p>
+        </w:tc>
+        <w:tc>
+          <w:tcPr>
+            <w:tcW w:type="dxa" w:w="1000"/>
+            <w:shd w:fill="F4F6F7" w:color="auto" w:val="clear"/>
+            <w:tcMar>
+              <w:top w:type="dxa" w:w="40"/>
+              <w:left w:type="dxa" w:w="80"/>
+              <w:bottom w:type="dxa" w:w="40"/>
+              <w:right w:type="dxa" w:w="80"/>
+            </w:tcMar>
+          </w:tcPr>
+          <w:p>
+            <w:pPr>
+              <w:spacing w:after="20"/>
+              <w:jc w:val="left"/>
+            </w:pPr>
+            <w:r>
+              <w:rPr>
+                <w:b w:val="false"/>
+                <w:bCs w:val="false"/>
+                <w:sz w:val="18"/>
+                <w:szCs w:val="18"/>
+              </w:rPr>
+              <w:t>Awaiting DCD data; structure final</w:t>
+            </w:r>
+          </w:p>
+        </w:tc>
+      </w:tr>
+    </w:tbl>
+    <w:p>
+      <w:pPr>
         <w:spacing w:before="200"/>
       </w:pPr>
       <w:r>
@@ -2395,6 +3568,1003 @@
         <w:t xml:space="preserve">Next sessions will be added below as they are developed.</w:t>
       </w:r>
     </w:p>
+    <w:p>
+      <w:pPr>
+        <w:pStyle w:val="Heading1"/>
+        <w:spacing w:after="80" w:before="120"/>
+      </w:pPr>
+      <w:r>
+        <w:rPr>
+          <w:b/>
+          <w:bCs/>
+        </w:rPr>
+        <w:t xml:space="preserve">Oct 13, Session 3 — Reading Matching Results (Two Case Studies)</w:t>
+      </w:r>
+    </w:p>
+    <w:tbl>
+      <w:tblPr>
+        <w:tblW w:type="dxa" w:w="12960"/>
+        <w:tblBorders>
+          <w:top w:val="single" w:color="auto" w:sz="4"/>
+          <w:left w:val="single" w:color="auto" w:sz="4"/>
+          <w:bottom w:val="single" w:color="auto" w:sz="4"/>
+          <w:right w:val="single" w:color="auto" w:sz="4"/>
+          <w:insideH w:val="single" w:color="auto" w:sz="4"/>
+          <w:insideV w:val="single" w:color="auto" w:sz="4"/>
+        </w:tblBorders>
+      </w:tblPr>
+      <w:tblGrid>
+        <w:gridCol w:w="2200"/>
+        <w:gridCol w:w="1700"/>
+        <w:gridCol w:w="1400"/>
+        <w:gridCol w:w="3000"/>
+        <w:gridCol w:w="3660"/>
+        <w:gridCol w:w="1000"/>
+      </w:tblGrid>
+      <w:tr>
+        <w:trPr>
+          <w:tblHeader/>
+        </w:trPr>
+        <w:tc>
+          <w:tcPr>
+            <w:tcW w:type="dxa" w:w="2200"/>
+            <w:shd w:fill="00789E" w:color="auto" w:val="clear"/>
+            <w:tcMar>
+              <w:top w:type="dxa" w:w="40"/>
+              <w:left w:type="dxa" w:w="80"/>
+              <w:bottom w:type="dxa" w:w="40"/>
+              <w:right w:type="dxa" w:w="80"/>
+            </w:tcMar>
+          </w:tcPr>
+          <w:p>
+            <w:pPr>
+              <w:spacing w:after="20"/>
+              <w:jc w:val="left"/>
+            </w:pPr>
+            <w:r>
+              <w:rPr>
+                <w:b/>
+                <w:bCs/>
+                <w:color w:val="FFFFFF"/>
+                <w:sz w:val="18"/>
+                <w:szCs w:val="18"/>
+              </w:rPr>
+              <w:t>Exercise</w:t>
+            </w:r>
+          </w:p>
+        </w:tc>
+        <w:tc>
+          <w:tcPr>
+            <w:tcW w:type="dxa" w:w="1700"/>
+            <w:shd w:fill="00789E" w:color="auto" w:val="clear"/>
+            <w:tcMar>
+              <w:top w:type="dxa" w:w="40"/>
+              <w:left w:type="dxa" w:w="80"/>
+              <w:bottom w:type="dxa" w:w="40"/>
+              <w:right w:type="dxa" w:w="80"/>
+            </w:tcMar>
+          </w:tcPr>
+          <w:p>
+            <w:pPr>
+              <w:spacing w:after="20"/>
+              <w:jc w:val="left"/>
+            </w:pPr>
+            <w:r>
+              <w:rPr>
+                <w:b/>
+                <w:bCs/>
+                <w:color w:val="FFFFFF"/>
+                <w:sz w:val="18"/>
+                <w:szCs w:val="18"/>
+              </w:rPr>
+              <w:t>When (approx.)</w:t>
+            </w:r>
+          </w:p>
+        </w:tc>
+        <w:tc>
+          <w:tcPr>
+            <w:tcW w:type="dxa" w:w="1400"/>
+            <w:shd w:fill="00789E" w:color="auto" w:val="clear"/>
+            <w:tcMar>
+              <w:top w:type="dxa" w:w="40"/>
+              <w:left w:type="dxa" w:w="80"/>
+              <w:bottom w:type="dxa" w:w="40"/>
+              <w:right w:type="dxa" w:w="80"/>
+            </w:tcMar>
+          </w:tcPr>
+          <w:p>
+            <w:pPr>
+              <w:spacing w:after="20"/>
+              <w:jc w:val="left"/>
+            </w:pPr>
+            <w:r>
+              <w:rPr>
+                <w:b/>
+                <w:bCs/>
+                <w:color w:val="FFFFFF"/>
+                <w:sz w:val="18"/>
+                <w:szCs w:val="18"/>
+              </w:rPr>
+              <w:t>Type</w:t>
+            </w:r>
+          </w:p>
+        </w:tc>
+        <w:tc>
+          <w:tcPr>
+            <w:tcW w:type="dxa" w:w="3000"/>
+            <w:shd w:fill="00789E" w:color="auto" w:val="clear"/>
+            <w:tcMar>
+              <w:top w:type="dxa" w:w="40"/>
+              <w:left w:type="dxa" w:w="80"/>
+              <w:bottom w:type="dxa" w:w="40"/>
+              <w:right w:type="dxa" w:w="80"/>
+            </w:tcMar>
+          </w:tcPr>
+          <w:p>
+            <w:pPr>
+              <w:spacing w:after="20"/>
+              <w:jc w:val="left"/>
+            </w:pPr>
+            <w:r>
+              <w:rPr>
+                <w:b/>
+                <w:bCs/>
+                <w:color w:val="FFFFFF"/>
+                <w:sz w:val="18"/>
+                <w:szCs w:val="18"/>
+              </w:rPr>
+              <w:t>Materials needed</w:t>
+            </w:r>
+          </w:p>
+        </w:tc>
+        <w:tc>
+          <w:tcPr>
+            <w:tcW w:type="dxa" w:w="3660"/>
+            <w:shd w:fill="00789E" w:color="auto" w:val="clear"/>
+            <w:tcMar>
+              <w:top w:type="dxa" w:w="40"/>
+              <w:left w:type="dxa" w:w="80"/>
+              <w:bottom w:type="dxa" w:w="40"/>
+              <w:right w:type="dxa" w:w="80"/>
+            </w:tcMar>
+          </w:tcPr>
+          <w:p>
+            <w:pPr>
+              <w:spacing w:after="20"/>
+              <w:jc w:val="left"/>
+            </w:pPr>
+            <w:r>
+              <w:rPr>
+                <w:b/>
+                <w:bCs/>
+                <w:color w:val="FFFFFF"/>
+                <w:sz w:val="18"/>
+                <w:szCs w:val="18"/>
+              </w:rPr>
+              <w:t>What the partner builds / needs to know</w:t>
+            </w:r>
+          </w:p>
+        </w:tc>
+        <w:tc>
+          <w:tcPr>
+            <w:tcW w:type="dxa" w:w="1000"/>
+            <w:shd w:fill="00789E" w:color="auto" w:val="clear"/>
+            <w:tcMar>
+              <w:top w:type="dxa" w:w="40"/>
+              <w:left w:type="dxa" w:w="80"/>
+              <w:bottom w:type="dxa" w:w="40"/>
+              <w:right w:type="dxa" w:w="80"/>
+            </w:tcMar>
+          </w:tcPr>
+          <w:p>
+            <w:pPr>
+              <w:spacing w:after="20"/>
+              <w:jc w:val="left"/>
+            </w:pPr>
+            <w:r>
+              <w:rPr>
+                <w:b/>
+                <w:bCs/>
+                <w:color w:val="FFFFFF"/>
+                <w:sz w:val="18"/>
+                <w:szCs w:val="18"/>
+              </w:rPr>
+              <w:t>Status</w:t>
+            </w:r>
+          </w:p>
+        </w:tc>
+      </w:tr>
+      <w:tr>
+        <w:tc>
+          <w:tcPr>
+            <w:tcW w:type="dxa" w:w="2200"/>
+            <w:tcMar>
+              <w:top w:type="dxa" w:w="40"/>
+              <w:left w:type="dxa" w:w="80"/>
+              <w:bottom w:type="dxa" w:w="40"/>
+              <w:right w:type="dxa" w:w="80"/>
+            </w:tcMar>
+          </w:tcPr>
+          <w:p>
+            <w:pPr>
+              <w:spacing w:after="20"/>
+              <w:jc w:val="left"/>
+            </w:pPr>
+            <w:r>
+              <w:rPr>
+                <w:b/>
+                <w:bCs/>
+                <w:sz w:val="18"/>
+                <w:szCs w:val="18"/>
+              </w:rPr>
+              <w:t xml:space="preserve">Opening show of hands — the naive gap</w:t>
+            </w:r>
+          </w:p>
+        </w:tc>
+        <w:tc>
+          <w:tcPr>
+            <w:tcW w:type="dxa" w:w="1700"/>
+            <w:tcMar>
+              <w:top w:type="dxa" w:w="40"/>
+              <w:left w:type="dxa" w:w="80"/>
+              <w:bottom w:type="dxa" w:w="40"/>
+              <w:right w:type="dxa" w:w="80"/>
+            </w:tcMar>
+          </w:tcPr>
+          <w:p>
+            <w:pPr>
+              <w:spacing w:after="20"/>
+              <w:jc w:val="left"/>
+            </w:pPr>
+            <w:r>
+              <w:rPr>
+                <w:b w:val="false"/>
+                <w:bCs w:val="false"/>
+                <w:sz w:val="18"/>
+                <w:szCs w:val="18"/>
+              </w:rPr>
+              <w:t xml:space="preserve">~0:08 · Section 1, slide “A convincing comparison”</w:t>
+            </w:r>
+          </w:p>
+        </w:tc>
+        <w:tc>
+          <w:tcPr>
+            <w:tcW w:type="dxa" w:w="1400"/>
+            <w:tcMar>
+              <w:top w:type="dxa" w:w="40"/>
+              <w:left w:type="dxa" w:w="80"/>
+              <w:bottom w:type="dxa" w:w="40"/>
+              <w:right w:type="dxa" w:w="80"/>
+            </w:tcMar>
+          </w:tcPr>
+          <w:p>
+            <w:pPr>
+              <w:spacing w:after="20"/>
+              <w:jc w:val="left"/>
+            </w:pPr>
+            <w:r>
+              <w:rPr>
+                <w:b w:val="false"/>
+                <w:bCs w:val="false"/>
+                <w:sz w:val="18"/>
+                <w:szCs w:val="18"/>
+              </w:rPr>
+              <w:t xml:space="preserve">Live show of hands (or Menti)</w:t>
+            </w:r>
+          </w:p>
+        </w:tc>
+        <w:tc>
+          <w:tcPr>
+            <w:tcW w:type="dxa" w:w="3000"/>
+            <w:tcMar>
+              <w:top w:type="dxa" w:w="40"/>
+              <w:left w:type="dxa" w:w="80"/>
+              <w:bottom w:type="dxa" w:w="40"/>
+              <w:right w:type="dxa" w:w="80"/>
+            </w:tcMar>
+          </w:tcPr>
+          <w:p>
+            <w:pPr>
+              <w:spacing w:after="20"/>
+              <w:jc w:val="left"/>
+            </w:pPr>
+            <w:r>
+              <w:rPr>
+                <w:b w:val="false"/>
+                <w:bCs w:val="false"/>
+                <w:sz w:val="18"/>
+                <w:szCs w:val="18"/>
+              </w:rPr>
+              <w:t xml:space="preserve">None (optional flipchart or Menti poll)</w:t>
+            </w:r>
+          </w:p>
+        </w:tc>
+        <w:tc>
+          <w:tcPr>
+            <w:tcW w:type="dxa" w:w="3660"/>
+            <w:tcMar>
+              <w:top w:type="dxa" w:w="40"/>
+              <w:left w:type="dxa" w:w="80"/>
+              <w:bottom w:type="dxa" w:w="40"/>
+              <w:right w:type="dxa" w:w="80"/>
+            </w:tcMar>
+          </w:tcPr>
+          <w:p>
+            <w:pPr>
+              <w:spacing w:after="20"/>
+              <w:jc w:val="left"/>
+            </w:pPr>
+            <w:r>
+              <w:rPr>
+                <w:b w:val="false"/>
+                <w:bCs w:val="false"/>
+                <w:sz w:val="18"/>
+                <w:szCs w:val="18"/>
+              </w:rPr>
+              <w:t xml:space="preserve">One question before the reveal: “Enrolled businesses spend far less than those that did not. Did the programme cause that whole gap?” Record the room’s guess, then revisit after the selection point on the next slide. Partner: optional single-MC Menti (Yes / No / Can’t tell) if run digitally.</w:t>
+            </w:r>
+          </w:p>
+        </w:tc>
+        <w:tc>
+          <w:tcPr>
+            <w:tcW w:type="dxa" w:w="1000"/>
+            <w:tcMar>
+              <w:top w:type="dxa" w:w="40"/>
+              <w:left w:type="dxa" w:w="80"/>
+              <w:bottom w:type="dxa" w:w="40"/>
+              <w:right w:type="dxa" w:w="80"/>
+            </w:tcMar>
+          </w:tcPr>
+          <w:p>
+            <w:pPr>
+              <w:spacing w:after="20"/>
+              <w:jc w:val="left"/>
+            </w:pPr>
+            <w:r>
+              <w:rPr>
+                <w:b w:val="false"/>
+                <w:bCs w:val="false"/>
+                <w:sz w:val="18"/>
+                <w:szCs w:val="18"/>
+              </w:rPr>
+              <w:t xml:space="preserve">In slides (hands); Menti optional</w:t>
+            </w:r>
+          </w:p>
+        </w:tc>
+      </w:tr>
+      <w:tr>
+        <w:tc>
+          <w:tcPr>
+            <w:tcW w:type="dxa" w:w="2200"/>
+            <w:tcMar>
+              <w:top w:type="dxa" w:w="40"/>
+              <w:left w:type="dxa" w:w="80"/>
+              <w:bottom w:type="dxa" w:w="40"/>
+              <w:right w:type="dxa" w:w="80"/>
+            </w:tcMar>
+          </w:tcPr>
+          <w:p>
+            <w:pPr>
+              <w:spacing w:after="20"/>
+              <w:jc w:val="left"/>
+            </w:pPr>
+            <w:r>
+              <w:rPr>
+                <w:b/>
+                <w:bCs/>
+                <w:sz w:val="18"/>
+                <w:szCs w:val="18"/>
+              </w:rPr>
+              <w:t xml:space="preserve">“Find the twins” — matching by hand</w:t>
+            </w:r>
+          </w:p>
+        </w:tc>
+        <w:tc>
+          <w:tcPr>
+            <w:tcW w:type="dxa" w:w="1700"/>
+            <w:tcMar>
+              <w:top w:type="dxa" w:w="40"/>
+              <w:left w:type="dxa" w:w="80"/>
+              <w:bottom w:type="dxa" w:w="40"/>
+              <w:right w:type="dxa" w:w="80"/>
+            </w:tcMar>
+          </w:tcPr>
+          <w:p>
+            <w:pPr>
+              <w:spacing w:after="20"/>
+              <w:jc w:val="left"/>
+            </w:pPr>
+            <w:r>
+              <w:rPr>
+                <w:b w:val="false"/>
+                <w:bCs w:val="false"/>
+                <w:sz w:val="18"/>
+                <w:szCs w:val="18"/>
+              </w:rPr>
+              <w:t xml:space="preserve">~0:18 · Section 2, slide “Your turn: find the twins”</w:t>
+            </w:r>
+          </w:p>
+        </w:tc>
+        <w:tc>
+          <w:tcPr>
+            <w:tcW w:type="dxa" w:w="1400"/>
+            <w:tcMar>
+              <w:top w:type="dxa" w:w="40"/>
+              <w:left w:type="dxa" w:w="80"/>
+              <w:bottom w:type="dxa" w:w="40"/>
+              <w:right w:type="dxa" w:w="80"/>
+            </w:tcMar>
+          </w:tcPr>
+          <w:p>
+            <w:pPr>
+              <w:spacing w:after="20"/>
+              <w:jc w:val="left"/>
+            </w:pPr>
+            <w:r>
+              <w:rPr>
+                <w:b w:val="false"/>
+                <w:bCs w:val="false"/>
+                <w:sz w:val="18"/>
+                <w:szCs w:val="18"/>
+              </w:rPr>
+              <w:t xml:space="preserve">Individual hands-on</w:t>
+            </w:r>
+          </w:p>
+        </w:tc>
+        <w:tc>
+          <w:tcPr>
+            <w:tcW w:type="dxa" w:w="3000"/>
+            <w:tcMar>
+              <w:top w:type="dxa" w:w="40"/>
+              <w:left w:type="dxa" w:w="80"/>
+              <w:bottom w:type="dxa" w:w="40"/>
+              <w:right w:type="dxa" w:w="80"/>
+            </w:tcMar>
+          </w:tcPr>
+          <w:p>
+            <w:pPr>
+              <w:spacing w:after="20"/>
+              <w:jc w:val="left"/>
+            </w:pPr>
+            <w:r>
+              <w:rPr>
+                <w:b w:val="false"/>
+                <w:bCs w:val="false"/>
+                <w:sz w:val="18"/>
+                <w:szCs w:val="18"/>
+              </w:rPr>
+              <w:t xml:space="preserve">Printed “twins card”, one per participant</w:t>
+            </w:r>
+          </w:p>
+        </w:tc>
+        <w:tc>
+          <w:tcPr>
+            <w:tcW w:type="dxa" w:w="3660"/>
+            <w:tcMar>
+              <w:top w:type="dxa" w:w="40"/>
+              <w:left w:type="dxa" w:w="80"/>
+              <w:bottom w:type="dxa" w:w="40"/>
+              <w:right w:type="dxa" w:w="80"/>
+            </w:tcMar>
+          </w:tcPr>
+          <w:p>
+            <w:pPr>
+              <w:spacing w:after="20"/>
+              <w:jc w:val="left"/>
+            </w:pPr>
+            <w:r>
+              <w:rPr>
+                <w:b w:val="false"/>
+                <w:bCs w:val="false"/>
+                <w:sz w:val="18"/>
+                <w:szCs w:val="18"/>
+              </w:rPr>
+              <w:t xml:space="preserve">Participants match each of 3 enrolled businesses to the most similar not-enrolled candidate (on characteristics, not cost), then read off the cost gap between the pairs. Partner: design a clean one-page card mirroring the slide’s table (3 enrolled rows, 3 candidates), with space to draw the pairings and note the gap. The point they should feel: matching discards candidates with no good twin.</w:t>
+            </w:r>
+          </w:p>
+        </w:tc>
+        <w:tc>
+          <w:tcPr>
+            <w:tcW w:type="dxa" w:w="1000"/>
+            <w:tcMar>
+              <w:top w:type="dxa" w:w="40"/>
+              <w:left w:type="dxa" w:w="80"/>
+              <w:bottom w:type="dxa" w:w="40"/>
+              <w:right w:type="dxa" w:w="80"/>
+            </w:tcMar>
+          </w:tcPr>
+          <w:p>
+            <w:pPr>
+              <w:spacing w:after="20"/>
+              <w:jc w:val="left"/>
+            </w:pPr>
+            <w:r>
+              <w:rPr>
+                <w:b w:val="false"/>
+                <w:bCs w:val="false"/>
+                <w:sz w:val="18"/>
+                <w:szCs w:val="18"/>
+              </w:rPr>
+              <w:t xml:space="preserve">Handout to build</w:t>
+            </w:r>
+          </w:p>
+        </w:tc>
+      </w:tr>
+      <w:tr>
+        <w:tc>
+          <w:tcPr>
+            <w:tcW w:type="dxa" w:w="2200"/>
+            <w:tcMar>
+              <w:top w:type="dxa" w:w="40"/>
+              <w:left w:type="dxa" w:w="80"/>
+              <w:bottom w:type="dxa" w:w="40"/>
+              <w:right w:type="dxa" w:w="80"/>
+            </w:tcMar>
+          </w:tcPr>
+          <w:p>
+            <w:pPr>
+              <w:spacing w:after="20"/>
+              <w:jc w:val="left"/>
+            </w:pPr>
+            <w:r>
+              <w:rPr>
+                <w:b/>
+                <w:bCs/>
+                <w:sz w:val="18"/>
+                <w:szCs w:val="18"/>
+              </w:rPr>
+              <w:t xml:space="preserve">AI Snapshot — main group exercise</w:t>
+            </w:r>
+          </w:p>
+        </w:tc>
+        <w:tc>
+          <w:tcPr>
+            <w:tcW w:type="dxa" w:w="1700"/>
+            <w:tcMar>
+              <w:top w:type="dxa" w:w="40"/>
+              <w:left w:type="dxa" w:w="80"/>
+              <w:bottom w:type="dxa" w:w="40"/>
+              <w:right w:type="dxa" w:w="80"/>
+            </w:tcMar>
+          </w:tcPr>
+          <w:p>
+            <w:pPr>
+              <w:spacing w:after="20"/>
+              <w:jc w:val="left"/>
+            </w:pPr>
+            <w:r>
+              <w:rPr>
+                <w:b w:val="false"/>
+                <w:bCs w:val="false"/>
+                <w:sz w:val="18"/>
+                <w:szCs w:val="18"/>
+              </w:rPr>
+              <w:t xml:space="preserve">~1:00–1:14 · Section 6</w:t>
+            </w:r>
+          </w:p>
+        </w:tc>
+        <w:tc>
+          <w:tcPr>
+            <w:tcW w:type="dxa" w:w="1400"/>
+            <w:tcMar>
+              <w:top w:type="dxa" w:w="40"/>
+              <w:left w:type="dxa" w:w="80"/>
+              <w:bottom w:type="dxa" w:w="40"/>
+              <w:right w:type="dxa" w:w="80"/>
+            </w:tcMar>
+          </w:tcPr>
+          <w:p>
+            <w:pPr>
+              <w:spacing w:after="20"/>
+              <w:jc w:val="left"/>
+            </w:pPr>
+            <w:r>
+              <w:rPr>
+                <w:b w:val="false"/>
+                <w:bCs w:val="false"/>
+                <w:sz w:val="18"/>
+                <w:szCs w:val="18"/>
+              </w:rPr>
+              <w:t xml:space="preserve">Group work (pairs / tables)</w:t>
+            </w:r>
+          </w:p>
+        </w:tc>
+        <w:tc>
+          <w:tcPr>
+            <w:tcW w:type="dxa" w:w="3000"/>
+            <w:tcMar>
+              <w:top w:type="dxa" w:w="40"/>
+              <w:left w:type="dxa" w:w="80"/>
+              <w:bottom w:type="dxa" w:w="40"/>
+              <w:right w:type="dxa" w:w="80"/>
+            </w:tcMar>
+          </w:tcPr>
+          <w:p>
+            <w:pPr>
+              <w:spacing w:after="20"/>
+              <w:jc w:val="left"/>
+            </w:pPr>
+            <w:r>
+              <w:rPr>
+                <w:b w:val="false"/>
+                <w:bCs w:val="false"/>
+                <w:sz w:val="18"/>
+                <w:szCs w:val="18"/>
+              </w:rPr>
+              <w:t xml:space="preserve">Printed flawed AI answer (for mark-up), one per pair; two prompt cards (short Prompt A, full Prompt B), one set per group; the matching table on the handout; a working AI tool per table, tested beforehand</w:t>
+            </w:r>
+          </w:p>
+        </w:tc>
+        <w:tc>
+          <w:tcPr>
+            <w:tcW w:type="dxa" w:w="3660"/>
+            <w:tcMar>
+              <w:top w:type="dxa" w:w="40"/>
+              <w:left w:type="dxa" w:w="80"/>
+              <w:bottom w:type="dxa" w:w="40"/>
+              <w:right w:type="dxa" w:w="80"/>
+            </w:tcMar>
+          </w:tcPr>
+          <w:p>
+            <w:pPr>
+              <w:spacing w:after="20"/>
+              <w:jc w:val="left"/>
+            </w:pPr>
+            <w:r>
+              <w:rPr>
+                <w:b w:val="false"/>
+                <w:bCs w:val="false"/>
+                <w:sz w:val="18"/>
+                <w:szCs w:val="18"/>
+              </w:rPr>
+              <w:t xml:space="preserve">Three parts: (1) groups mark up the flawed AI answer and find the four planted errors (balance treated as proof of no bias; a fabricated robustness-to-unobservables check; ignoring the 1,000 AED rule; invented p-value); (2) run the short prompt vs the full prompt on the same table and compare; (3) paste the second answer into a fresh chat and ask it to review for errors. Partner: produce the printed flawed-answer handout (verbatim response with the four errors) plus a facilitator key, the two prompt cards, and a short debrief worksheet. NOTE: the flawed answer in the deck is an invented placeholder for now; swap in Fiona’s real screenshot capture when available.</w:t>
+            </w:r>
+          </w:p>
+        </w:tc>
+        <w:tc>
+          <w:tcPr>
+            <w:tcW w:type="dxa" w:w="1000"/>
+            <w:tcMar>
+              <w:top w:type="dxa" w:w="40"/>
+              <w:left w:type="dxa" w:w="80"/>
+              <w:bottom w:type="dxa" w:w="40"/>
+              <w:right w:type="dxa" w:w="80"/>
+            </w:tcMar>
+          </w:tcPr>
+          <w:p>
+            <w:pPr>
+              <w:spacing w:after="20"/>
+              <w:jc w:val="left"/>
+            </w:pPr>
+            <w:r>
+              <w:rPr>
+                <w:b w:val="false"/>
+                <w:bCs w:val="false"/>
+                <w:sz w:val="18"/>
+                <w:szCs w:val="18"/>
+              </w:rPr>
+              <w:t xml:space="preserve">Handouts to build (deck refers to them)</w:t>
+            </w:r>
+          </w:p>
+        </w:tc>
+      </w:tr>
+      <w:tr>
+        <w:tc>
+          <w:tcPr>
+            <w:tcW w:type="dxa" w:w="2200"/>
+            <w:tcMar>
+              <w:top w:type="dxa" w:w="40"/>
+              <w:left w:type="dxa" w:w="80"/>
+              <w:bottom w:type="dxa" w:w="40"/>
+              <w:right w:type="dxa" w:w="80"/>
+            </w:tcMar>
+          </w:tcPr>
+          <w:p>
+            <w:pPr>
+              <w:spacing w:after="20"/>
+              <w:jc w:val="left"/>
+            </w:pPr>
+            <w:r>
+              <w:rPr>
+                <w:b/>
+                <w:bCs/>
+                <w:sz w:val="18"/>
+                <w:szCs w:val="18"/>
+              </w:rPr>
+              <w:t xml:space="preserve">Two case studies — “which do you believe?”</w:t>
+            </w:r>
+          </w:p>
+        </w:tc>
+        <w:tc>
+          <w:tcPr>
+            <w:tcW w:type="dxa" w:w="1700"/>
+            <w:tcMar>
+              <w:top w:type="dxa" w:w="40"/>
+              <w:left w:type="dxa" w:w="80"/>
+              <w:bottom w:type="dxa" w:w="40"/>
+              <w:right w:type="dxa" w:w="80"/>
+            </w:tcMar>
+          </w:tcPr>
+          <w:p>
+            <w:pPr>
+              <w:spacing w:after="20"/>
+              <w:jc w:val="left"/>
+            </w:pPr>
+            <w:r>
+              <w:rPr>
+                <w:b w:val="false"/>
+                <w:bCs w:val="false"/>
+                <w:sz w:val="18"/>
+                <w:szCs w:val="18"/>
+              </w:rPr>
+              <w:t xml:space="preserve">~1:20–1:30 · Section 7, slide “Which one do you believe?”</w:t>
+            </w:r>
+          </w:p>
+        </w:tc>
+        <w:tc>
+          <w:tcPr>
+            <w:tcW w:type="dxa" w:w="1400"/>
+            <w:tcMar>
+              <w:top w:type="dxa" w:w="40"/>
+              <w:left w:type="dxa" w:w="80"/>
+              <w:bottom w:type="dxa" w:w="40"/>
+              <w:right w:type="dxa" w:w="80"/>
+            </w:tcMar>
+          </w:tcPr>
+          <w:p>
+            <w:pPr>
+              <w:spacing w:after="20"/>
+              <w:jc w:val="left"/>
+            </w:pPr>
+            <w:r>
+              <w:rPr>
+                <w:b w:val="false"/>
+                <w:bCs w:val="false"/>
+                <w:sz w:val="18"/>
+                <w:szCs w:val="18"/>
+              </w:rPr>
+              <w:t xml:space="preserve">Group work + verdict round</w:t>
+            </w:r>
+          </w:p>
+        </w:tc>
+        <w:tc>
+          <w:tcPr>
+            <w:tcW w:type="dxa" w:w="3000"/>
+            <w:tcMar>
+              <w:top w:type="dxa" w:w="40"/>
+              <w:left w:type="dxa" w:w="80"/>
+              <w:bottom w:type="dxa" w:w="40"/>
+              <w:right w:type="dxa" w:w="80"/>
+            </w:tcMar>
+          </w:tcPr>
+          <w:p>
+            <w:pPr>
+              <w:spacing w:after="20"/>
+              <w:jc w:val="left"/>
+            </w:pPr>
+            <w:r>
+              <w:rPr>
+                <w:b w:val="false"/>
+                <w:bCs w:val="false"/>
+                <w:sz w:val="18"/>
+                <w:szCs w:val="18"/>
+              </w:rPr>
+              <w:t xml:space="preserve">Case 1 (GreenWaste) summary; Case 2 (Abu Dhabi DCD) handout — pending real DCD findings</w:t>
+            </w:r>
+          </w:p>
+        </w:tc>
+        <w:tc>
+          <w:tcPr>
+            <w:tcW w:type="dxa" w:w="3660"/>
+            <w:tcMar>
+              <w:top w:type="dxa" w:w="40"/>
+              <w:left w:type="dxa" w:w="80"/>
+              <w:bottom w:type="dxa" w:w="40"/>
+              <w:right w:type="dxa" w:w="80"/>
+            </w:tcMar>
+          </w:tcPr>
+          <w:p>
+            <w:pPr>
+              <w:spacing w:after="20"/>
+              <w:jc w:val="left"/>
+            </w:pPr>
+            <w:r>
+              <w:rPr>
+                <w:b w:val="false"/>
+                <w:bCs w:val="false"/>
+                <w:sz w:val="18"/>
+                <w:szCs w:val="18"/>
+              </w:rPr>
+              <w:t xml:space="preserve">Groups compare a clean matching study (Case 1) with a messy one where many treated units had no good match (Case 2): which gives more confidence and why, what they would ask Case 2’s evaluator that Case 1 does not raise, then a verdict round (act / act with caveats / send back). Partner: build two one-page case summaries (overlap picture, share of treated units matched, the estimate and its uncertainty) for side-by-side reading, plus simple verdict cards. Build Case 2 once the DCD data arrives; structure mirrors the GreenWaste reading.</w:t>
+            </w:r>
+          </w:p>
+        </w:tc>
+        <w:tc>
+          <w:tcPr>
+            <w:tcW w:type="dxa" w:w="1000"/>
+            <w:tcMar>
+              <w:top w:type="dxa" w:w="40"/>
+              <w:left w:type="dxa" w:w="80"/>
+              <w:bottom w:type="dxa" w:w="40"/>
+              <w:right w:type="dxa" w:w="80"/>
+            </w:tcMar>
+          </w:tcPr>
+          <w:p>
+            <w:pPr>
+              <w:spacing w:after="20"/>
+              <w:jc w:val="left"/>
+            </w:pPr>
+            <w:r>
+              <w:rPr>
+                <w:b w:val="false"/>
+                <w:bCs w:val="false"/>
+                <w:sz w:val="18"/>
+                <w:szCs w:val="18"/>
+              </w:rPr>
+              <w:t xml:space="preserve">PLACEHOLDER — awaiting DCD data</w:t>
+            </w:r>
+          </w:p>
+        </w:tc>
+      </w:tr>
+      <w:tr>
+        <w:tc>
+          <w:tcPr>
+            <w:tcW w:type="dxa" w:w="2200"/>
+            <w:tcMar>
+              <w:top w:type="dxa" w:w="40"/>
+              <w:left w:type="dxa" w:w="80"/>
+              <w:bottom w:type="dxa" w:w="40"/>
+              <w:right w:type="dxa" w:w="80"/>
+            </w:tcMar>
+          </w:tcPr>
+          <w:p>
+            <w:pPr>
+              <w:spacing w:after="20"/>
+              <w:jc w:val="left"/>
+            </w:pPr>
+            <w:r>
+              <w:rPr>
+                <w:b/>
+                <w:bCs/>
+                <w:sz w:val="18"/>
+                <w:szCs w:val="18"/>
+              </w:rPr>
+              <w:t xml:space="preserve">Closing “three questions” take-away card</w:t>
+            </w:r>
+          </w:p>
+        </w:tc>
+        <w:tc>
+          <w:tcPr>
+            <w:tcW w:type="dxa" w:w="1700"/>
+            <w:tcMar>
+              <w:top w:type="dxa" w:w="40"/>
+              <w:left w:type="dxa" w:w="80"/>
+              <w:bottom w:type="dxa" w:w="40"/>
+              <w:right w:type="dxa" w:w="80"/>
+            </w:tcMar>
+          </w:tcPr>
+          <w:p>
+            <w:pPr>
+              <w:spacing w:after="20"/>
+              <w:jc w:val="left"/>
+            </w:pPr>
+            <w:r>
+              <w:rPr>
+                <w:b w:val="false"/>
+                <w:bCs w:val="false"/>
+                <w:sz w:val="18"/>
+                <w:szCs w:val="18"/>
+              </w:rPr>
+              <w:t xml:space="preserve">~1:32 · Section 8, closing slide</w:t>
+            </w:r>
+          </w:p>
+        </w:tc>
+        <w:tc>
+          <w:tcPr>
+            <w:tcW w:type="dxa" w:w="1400"/>
+            <w:tcMar>
+              <w:top w:type="dxa" w:w="40"/>
+              <w:left w:type="dxa" w:w="80"/>
+              <w:bottom w:type="dxa" w:w="40"/>
+              <w:right w:type="dxa" w:w="80"/>
+            </w:tcMar>
+          </w:tcPr>
+          <w:p>
+            <w:pPr>
+              <w:spacing w:after="20"/>
+              <w:jc w:val="left"/>
+            </w:pPr>
+            <w:r>
+              <w:rPr>
+                <w:b w:val="false"/>
+                <w:bCs w:val="false"/>
+                <w:sz w:val="18"/>
+                <w:szCs w:val="18"/>
+              </w:rPr>
+              <w:t xml:space="preserve">Handout (take-away)</w:t>
+            </w:r>
+          </w:p>
+        </w:tc>
+        <w:tc>
+          <w:tcPr>
+            <w:tcW w:type="dxa" w:w="3000"/>
+            <w:tcMar>
+              <w:top w:type="dxa" w:w="40"/>
+              <w:left w:type="dxa" w:w="80"/>
+              <w:bottom w:type="dxa" w:w="40"/>
+              <w:right w:type="dxa" w:w="80"/>
+            </w:tcMar>
+          </w:tcPr>
+          <w:p>
+            <w:pPr>
+              <w:spacing w:after="20"/>
+              <w:jc w:val="left"/>
+            </w:pPr>
+            <w:r>
+              <w:rPr>
+                <w:b w:val="false"/>
+                <w:bCs w:val="false"/>
+                <w:sz w:val="18"/>
+                <w:szCs w:val="18"/>
+              </w:rPr>
+              <w:t xml:space="preserve">Printed pocket card, one per participant</w:t>
+            </w:r>
+          </w:p>
+        </w:tc>
+        <w:tc>
+          <w:tcPr>
+            <w:tcW w:type="dxa" w:w="3660"/>
+            <w:tcMar>
+              <w:top w:type="dxa" w:w="40"/>
+              <w:left w:type="dxa" w:w="80"/>
+              <w:bottom w:type="dxa" w:w="40"/>
+              <w:right w:type="dxa" w:w="80"/>
+            </w:tcMar>
+          </w:tcPr>
+          <w:p>
+            <w:pPr>
+              <w:spacing w:after="20"/>
+              <w:jc w:val="left"/>
+            </w:pPr>
+            <w:r>
+              <w:rPr>
+                <w:b w:val="false"/>
+                <w:bCs w:val="false"/>
+                <w:sz w:val="18"/>
+                <w:szCs w:val="18"/>
+              </w:rPr>
+              <w:t xml:space="preserve">A small take-away card with the three questions to ask any evaluator presenting matching: what did you match on and what could you not measure? how many treated units had a good match, and who got dropped? does it clear our bar, and does the answer hold if you change what you matched on? Mirrors the closing slide. Optional.</w:t>
+            </w:r>
+          </w:p>
+        </w:tc>
+        <w:tc>
+          <w:tcPr>
+            <w:tcW w:type="dxa" w:w="1000"/>
+            <w:tcMar>
+              <w:top w:type="dxa" w:w="40"/>
+              <w:left w:type="dxa" w:w="80"/>
+              <w:bottom w:type="dxa" w:w="40"/>
+              <w:right w:type="dxa" w:w="80"/>
+            </w:tcMar>
+          </w:tcPr>
+          <w:p>
+            <w:pPr>
+              <w:spacing w:after="20"/>
+              <w:jc w:val="left"/>
+            </w:pPr>
+            <w:r>
+              <w:rPr>
+                <w:b w:val="false"/>
+                <w:bCs w:val="false"/>
+                <w:sz w:val="18"/>
+                <w:szCs w:val="18"/>
+              </w:rPr>
+              <w:t xml:space="preserve">Handout (optional)</w:t>
+            </w:r>
+          </w:p>
+        </w:tc>
+      </w:tr>
+    </w:tbl>
     <w:sectPr>
       <w:pgSz w:w="15840" w:h="12240" w:orient="landscape"/>
       <w:pgMar w:top="1080" w:right="1080" w:bottom="1080" w:left="1080" w:header="708" w:footer="708" w:gutter="0"/>

</xml_diff>